<commit_message>
Deploying to gh-pages from @ wonchan-choi/wonchan-choi.github.io@a88f3277dc3e32c6f6ae6563dd587080187d46d8 🚀
</commit_message>
<xml_diff>
--- a/assets/pdf/Choi_CV_2026-06-03.docx
+++ b/assets/pdf/Choi_CV_2026-06-03.docx
@@ -1816,21 +1816,7 @@
               <w:rPr>
                 <w:bCs/>
               </w:rPr>
-              <w:t xml:space="preserve">, Bak, H., An, J., Zhang, Y., &amp; </w:t>
-            </w:r>
-            <w:proofErr w:type="spellStart"/>
-            <w:r>
-              <w:rPr>
-                <w:bCs/>
-              </w:rPr>
-              <w:t>Stvilia</w:t>
-            </w:r>
-            <w:proofErr w:type="spellEnd"/>
-            <w:r>
-              <w:rPr>
-                <w:bCs/>
-              </w:rPr>
-              <w:t>, B. (202</w:t>
+              <w:t>, Bak, H., An, J., Zhang, Y., &amp; Stvilia, B. (202</w:t>
             </w:r>
             <w:r>
               <w:rPr>
@@ -2350,21 +2336,7 @@
               <w:rPr>
                 <w:bCs/>
               </w:rPr>
-              <w:t xml:space="preserve">, </w:t>
-            </w:r>
-            <w:proofErr w:type="spellStart"/>
-            <w:r>
-              <w:rPr>
-                <w:bCs/>
-              </w:rPr>
-              <w:t>Stvilia</w:t>
-            </w:r>
-            <w:proofErr w:type="spellEnd"/>
-            <w:r>
-              <w:rPr>
-                <w:bCs/>
-              </w:rPr>
-              <w:t xml:space="preserve">, B. &amp; Lee, H. S. (2023). </w:t>
+              <w:t xml:space="preserve">, Stvilia, B. &amp; Lee, H. S. (2023). </w:t>
             </w:r>
             <w:hyperlink r:id="rId14" w:history="1">
               <w:r>
@@ -2693,23 +2665,13 @@
               </w:rPr>
               <w:t xml:space="preserve">0. </w:t>
             </w:r>
-            <w:proofErr w:type="spellStart"/>
             <w:r>
               <w:rPr>
                 <w:bCs/>
                 <w:i/>
                 <w:iCs/>
               </w:rPr>
-              <w:t>Gerontechnology</w:t>
-            </w:r>
-            <w:proofErr w:type="spellEnd"/>
-            <w:r>
-              <w:rPr>
-                <w:bCs/>
-                <w:i/>
-                <w:iCs/>
-              </w:rPr>
-              <w:t>, 21</w:t>
+              <w:t>Gerontechnology, 21</w:t>
             </w:r>
             <w:r>
               <w:rPr>
@@ -4081,19 +4043,11 @@
             <w:r>
               <w:t xml:space="preserve">. </w:t>
             </w:r>
-            <w:proofErr w:type="spellStart"/>
             <w:r>
               <w:rPr>
                 <w:i/>
               </w:rPr>
-              <w:t>eGEMs</w:t>
-            </w:r>
-            <w:proofErr w:type="spellEnd"/>
-            <w:r>
-              <w:rPr>
-                <w:i/>
-              </w:rPr>
-              <w:t>, 5</w:t>
+              <w:t>eGEMs, 5</w:t>
             </w:r>
             <w:r>
               <w:t xml:space="preserve">(2). </w:t>
@@ -4480,13 +4434,8 @@
             <w:pPr>
               <w:jc w:val="left"/>
             </w:pPr>
-            <w:proofErr w:type="spellStart"/>
-            <w:r>
-              <w:t>Stvilia</w:t>
-            </w:r>
-            <w:proofErr w:type="spellEnd"/>
-            <w:r>
-              <w:t xml:space="preserve">, B., &amp; </w:t>
+            <w:r>
+              <w:t xml:space="preserve">Stvilia, B., &amp; </w:t>
             </w:r>
             <w:r>
               <w:rPr>
@@ -4641,15 +4590,7 @@
               <w:t>Choi, W.</w:t>
             </w:r>
             <w:r>
-              <w:t xml:space="preserve">, &amp; </w:t>
-            </w:r>
-            <w:proofErr w:type="spellStart"/>
-            <w:r>
-              <w:t>Stvilia</w:t>
-            </w:r>
-            <w:proofErr w:type="spellEnd"/>
-            <w:r>
-              <w:t xml:space="preserve">, B. (2015). </w:t>
+              <w:t xml:space="preserve">, &amp; Stvilia, B. (2015). </w:t>
             </w:r>
             <w:hyperlink r:id="rId28" w:history="1">
               <w:r>
@@ -5014,15 +4955,7 @@
               <w:t>Choi, W.</w:t>
             </w:r>
             <w:r>
-              <w:t xml:space="preserve">, Lee, J., </w:t>
-            </w:r>
-            <w:proofErr w:type="spellStart"/>
-            <w:r>
-              <w:t>Stvilia</w:t>
-            </w:r>
-            <w:proofErr w:type="spellEnd"/>
-            <w:r>
-              <w:t xml:space="preserve">, B., Zhang, Y., &amp; Bak, H. (2026). </w:t>
+              <w:t xml:space="preserve">, Lee, J., Stvilia, B., Zhang, Y., &amp; Bak, H. (2026). </w:t>
             </w:r>
             <w:hyperlink r:id="rId31" w:history="1">
               <w:r>
@@ -5046,15 +4979,7 @@
               <w:t>Information Research, 31</w:t>
             </w:r>
             <w:r>
-              <w:t>(</w:t>
-            </w:r>
-            <w:proofErr w:type="spellStart"/>
-            <w:r>
-              <w:t>iConf</w:t>
-            </w:r>
-            <w:proofErr w:type="spellEnd"/>
-            <w:r>
-              <w:t>), 1502–1514</w:t>
+              <w:t>(iConf), 1502–1514</w:t>
             </w:r>
             <w:r>
               <w:rPr>
@@ -5178,18 +5103,7 @@
               <w:t>Information Research, 31</w:t>
             </w:r>
             <w:r>
-              <w:t>(</w:t>
-            </w:r>
-            <w:proofErr w:type="spellStart"/>
-            <w:r>
-              <w:t>iConf</w:t>
-            </w:r>
-            <w:proofErr w:type="spellEnd"/>
-            <w:r>
-              <w:t xml:space="preserve">), </w:t>
-            </w:r>
-            <w:r>
-              <w:t>50–64</w:t>
+              <w:t>(iConf), 50–64</w:t>
             </w:r>
             <w:r>
               <w:t>.</w:t>
@@ -5294,15 +5208,7 @@
               <w:t>,</w:t>
             </w:r>
             <w:r>
-              <w:t xml:space="preserve"> Bak, H., </w:t>
-            </w:r>
-            <w:proofErr w:type="spellStart"/>
-            <w:r>
-              <w:t>Stvilia</w:t>
-            </w:r>
-            <w:proofErr w:type="spellEnd"/>
-            <w:r>
-              <w:t xml:space="preserve">, B., &amp; Zhang, Y. </w:t>
+              <w:t xml:space="preserve"> Bak, H., Stvilia, B., &amp; Zhang, Y. </w:t>
             </w:r>
             <w:r>
               <w:t>(202</w:t>
@@ -5848,15 +5754,7 @@
               <w:t>Choi, W.</w:t>
             </w:r>
             <w:r>
-              <w:t xml:space="preserve">, Zhang, Y., &amp; </w:t>
-            </w:r>
-            <w:proofErr w:type="spellStart"/>
-            <w:r>
-              <w:t>Stvilia</w:t>
-            </w:r>
-            <w:proofErr w:type="spellEnd"/>
-            <w:r>
-              <w:t xml:space="preserve">, B. (2024). </w:t>
+              <w:t xml:space="preserve">, Zhang, Y., &amp; Stvilia, B. (2024). </w:t>
             </w:r>
             <w:hyperlink r:id="rId37" w:history="1">
               <w:r>
@@ -6132,15 +6030,7 @@
               <w:t>Choi, W.</w:t>
             </w:r>
             <w:r>
-              <w:t xml:space="preserve">, Zhang, Y., &amp; </w:t>
-            </w:r>
-            <w:proofErr w:type="spellStart"/>
-            <w:r>
-              <w:t>Stvilia</w:t>
-            </w:r>
-            <w:proofErr w:type="spellEnd"/>
-            <w:r>
-              <w:t xml:space="preserve">, B. (2023). </w:t>
+              <w:t xml:space="preserve">, Zhang, Y., &amp; Stvilia, B. (2023). </w:t>
             </w:r>
             <w:hyperlink r:id="rId39" w:history="1">
               <w:r>
@@ -6309,23 +6199,7 @@
                 <w:i/>
                 <w:iCs/>
               </w:rPr>
-              <w:t xml:space="preserve">Proceedings of the </w:t>
-            </w:r>
-            <w:proofErr w:type="spellStart"/>
-            <w:r>
-              <w:rPr>
-                <w:i/>
-                <w:iCs/>
-              </w:rPr>
-              <w:t>iConference</w:t>
-            </w:r>
-            <w:proofErr w:type="spellEnd"/>
-            <w:r>
-              <w:rPr>
-                <w:i/>
-                <w:iCs/>
-              </w:rPr>
-              <w:t xml:space="preserve">. </w:t>
+              <w:t xml:space="preserve">Proceedings of the iConference. </w:t>
             </w:r>
           </w:p>
         </w:tc>
@@ -6384,15 +6258,7 @@
               <w:t>,</w:t>
             </w:r>
             <w:r>
-              <w:t xml:space="preserve"> &amp; </w:t>
-            </w:r>
-            <w:proofErr w:type="spellStart"/>
-            <w:r>
-              <w:t>Stvilia</w:t>
-            </w:r>
-            <w:proofErr w:type="spellEnd"/>
-            <w:r>
-              <w:t xml:space="preserve">, B. (2022). </w:t>
+              <w:t xml:space="preserve"> &amp; Stvilia, B. (2022). </w:t>
             </w:r>
             <w:hyperlink r:id="rId41" w:history="1">
               <w:r>
@@ -6413,17 +6279,8 @@
                 <w:i/>
                 <w:iCs/>
               </w:rPr>
-              <w:t xml:space="preserve">Proceedings of the 2022 </w:t>
-            </w:r>
-            <w:proofErr w:type="spellStart"/>
-            <w:r>
-              <w:rPr>
-                <w:i/>
-                <w:iCs/>
-              </w:rPr>
-              <w:t>iConference</w:t>
-            </w:r>
-            <w:proofErr w:type="spellEnd"/>
+              <w:t>Proceedings of the 2022 iConference</w:t>
+            </w:r>
             <w:r>
               <w:t xml:space="preserve">. </w:t>
             </w:r>
@@ -7133,21 +6990,7 @@
               <w:rPr>
                 <w:bCs/>
               </w:rPr>
-              <w:t xml:space="preserve">, &amp; </w:t>
-            </w:r>
-            <w:proofErr w:type="spellStart"/>
-            <w:r>
-              <w:rPr>
-                <w:bCs/>
-              </w:rPr>
-              <w:t>Stvilia</w:t>
-            </w:r>
-            <w:proofErr w:type="spellEnd"/>
-            <w:r>
-              <w:rPr>
-                <w:bCs/>
-              </w:rPr>
-              <w:t xml:space="preserve">, B. (2015). </w:t>
+              <w:t xml:space="preserve">, &amp; Stvilia, B. (2015). </w:t>
             </w:r>
             <w:hyperlink r:id="rId46" w:history="1">
               <w:r>
@@ -7164,23 +7007,13 @@
               </w:rPr>
               <w:t xml:space="preserve">nt. </w:t>
             </w:r>
-            <w:proofErr w:type="spellStart"/>
             <w:r>
               <w:rPr>
                 <w:bCs/>
                 <w:i/>
                 <w:iCs/>
               </w:rPr>
-              <w:t>iConference</w:t>
-            </w:r>
-            <w:proofErr w:type="spellEnd"/>
-            <w:r>
-              <w:rPr>
-                <w:bCs/>
-                <w:i/>
-                <w:iCs/>
-              </w:rPr>
-              <w:t xml:space="preserve"> 2015 Proceedings</w:t>
+              <w:t>iConference 2015 Proceedings</w:t>
             </w:r>
             <w:r>
               <w:rPr>
@@ -7301,21 +7134,7 @@
               <w:rPr>
                 <w:bCs/>
               </w:rPr>
-              <w:t xml:space="preserve">, &amp; </w:t>
-            </w:r>
-            <w:proofErr w:type="spellStart"/>
-            <w:r>
-              <w:rPr>
-                <w:bCs/>
-              </w:rPr>
-              <w:t>Stvilia</w:t>
-            </w:r>
-            <w:proofErr w:type="spellEnd"/>
-            <w:r>
-              <w:rPr>
-                <w:bCs/>
-              </w:rPr>
-              <w:t xml:space="preserve">, B. (2014). </w:t>
+              <w:t xml:space="preserve">, &amp; Stvilia, B. (2014). </w:t>
             </w:r>
             <w:hyperlink r:id="rId47" w:history="1">
               <w:r>
@@ -7452,21 +7271,7 @@
               <w:rPr>
                 <w:bCs/>
               </w:rPr>
-              <w:t xml:space="preserve">, &amp; </w:t>
-            </w:r>
-            <w:proofErr w:type="spellStart"/>
-            <w:r>
-              <w:rPr>
-                <w:bCs/>
-              </w:rPr>
-              <w:t>Stvilia</w:t>
-            </w:r>
-            <w:proofErr w:type="spellEnd"/>
-            <w:r>
-              <w:rPr>
-                <w:bCs/>
-              </w:rPr>
-              <w:t xml:space="preserve">, B. (2014). </w:t>
+              <w:t xml:space="preserve">, &amp; Stvilia, B. (2014). </w:t>
             </w:r>
             <w:hyperlink r:id="rId48" w:history="1">
               <w:r>
@@ -7483,23 +7288,13 @@
               </w:rPr>
               <w:t xml:space="preserve">ngs. </w:t>
             </w:r>
-            <w:proofErr w:type="spellStart"/>
             <w:r>
               <w:rPr>
                 <w:bCs/>
                 <w:i/>
                 <w:iCs/>
               </w:rPr>
-              <w:t>iConference</w:t>
-            </w:r>
-            <w:proofErr w:type="spellEnd"/>
-            <w:r>
-              <w:rPr>
-                <w:bCs/>
-                <w:i/>
-                <w:iCs/>
-              </w:rPr>
-              <w:t xml:space="preserve"> 2014 Proceedings, </w:t>
+              <w:t xml:space="preserve">iConference 2014 Proceedings, </w:t>
             </w:r>
             <w:r>
               <w:rPr>
@@ -7620,21 +7415,7 @@
               <w:rPr>
                 <w:bCs/>
               </w:rPr>
-              <w:t xml:space="preserve">, &amp; </w:t>
-            </w:r>
-            <w:proofErr w:type="spellStart"/>
-            <w:r>
-              <w:rPr>
-                <w:bCs/>
-              </w:rPr>
-              <w:t>Stvilia</w:t>
-            </w:r>
-            <w:proofErr w:type="spellEnd"/>
-            <w:r>
-              <w:rPr>
-                <w:bCs/>
-              </w:rPr>
-              <w:t xml:space="preserve">, B. (2013). </w:t>
+              <w:t xml:space="preserve">, &amp; Stvilia, B. (2013). </w:t>
             </w:r>
             <w:hyperlink r:id="rId49" w:history="1">
               <w:r>
@@ -7938,21 +7719,7 @@
                 <w:rPr>
                   <w:rStyle w:val="Hyperlink"/>
                 </w:rPr>
-                <w:t xml:space="preserve">The </w:t>
-              </w:r>
-              <w:proofErr w:type="spellStart"/>
-              <w:r>
-                <w:rPr>
-                  <w:rStyle w:val="Hyperlink"/>
-                </w:rPr>
-                <w:t>Sonzogno</w:t>
-              </w:r>
-              <w:proofErr w:type="spellEnd"/>
-              <w:r>
-                <w:rPr>
-                  <w:rStyle w:val="Hyperlink"/>
-                </w:rPr>
-                <w:t xml:space="preserve"> digital library project</w:t>
+                <w:t>The Sonzogno digital library project</w:t>
               </w:r>
             </w:hyperlink>
             <w:r>
@@ -8389,23 +8156,7 @@
                 <w:i/>
                 <w:iCs/>
               </w:rPr>
-              <w:t xml:space="preserve">Proceedings of the 2012 </w:t>
-            </w:r>
-            <w:proofErr w:type="spellStart"/>
-            <w:r>
-              <w:rPr>
-                <w:i/>
-                <w:iCs/>
-              </w:rPr>
-              <w:t>iConference</w:t>
-            </w:r>
-            <w:proofErr w:type="spellEnd"/>
-            <w:r>
-              <w:rPr>
-                <w:i/>
-                <w:iCs/>
-              </w:rPr>
-              <w:t xml:space="preserve">, </w:t>
+              <w:t xml:space="preserve">Proceedings of the 2012 iConference, </w:t>
             </w:r>
             <w:r>
               <w:t xml:space="preserve">538–540. </w:t>
@@ -8523,17 +8274,8 @@
                 <w:i/>
                 <w:iCs/>
               </w:rPr>
-              <w:t xml:space="preserve">Proceedings of the 2012 </w:t>
-            </w:r>
-            <w:proofErr w:type="spellStart"/>
-            <w:r>
-              <w:rPr>
-                <w:i/>
-                <w:iCs/>
-              </w:rPr>
-              <w:t>iConference</w:t>
-            </w:r>
-            <w:proofErr w:type="spellEnd"/>
+              <w:t>Proceedings of the 2012 iConference</w:t>
+            </w:r>
             <w:r>
               <w:t xml:space="preserve">, 620–622. </w:t>
             </w:r>
@@ -9895,21 +9637,7 @@
               <w:rPr>
                 <w:bCs/>
               </w:rPr>
-              <w:t xml:space="preserve">[Poster presentation]. Annual Research Meeting of the </w:t>
-            </w:r>
-            <w:proofErr w:type="spellStart"/>
-            <w:r>
-              <w:rPr>
-                <w:bCs/>
-              </w:rPr>
-              <w:t>AcademyHealth</w:t>
-            </w:r>
-            <w:proofErr w:type="spellEnd"/>
-            <w:r>
-              <w:rPr>
-                <w:bCs/>
-              </w:rPr>
-              <w:t xml:space="preserve"> 2017, New Orleans, LA</w:t>
+              <w:t>[Poster presentation]. Annual Research Meeting of the AcademyHealth 2017, New Orleans, LA</w:t>
             </w:r>
             <w:r>
               <w:rPr>
@@ -10195,21 +9923,7 @@
               <w:rPr>
                 <w:bCs/>
               </w:rPr>
-              <w:t xml:space="preserve">[Poster presentation]. </w:t>
-            </w:r>
-            <w:proofErr w:type="spellStart"/>
-            <w:r>
-              <w:rPr>
-                <w:bCs/>
-              </w:rPr>
-              <w:t>Concordium</w:t>
-            </w:r>
-            <w:proofErr w:type="spellEnd"/>
-            <w:r>
-              <w:rPr>
-                <w:bCs/>
-              </w:rPr>
-              <w:t xml:space="preserve"> 2016, Arlington, VA</w:t>
+              <w:t>[Poster presentation]. Concordium 2016, Arlington, VA</w:t>
             </w:r>
             <w:r>
               <w:rPr>
@@ -13346,35 +13060,7 @@
               <w:rPr>
                 <w:color w:val="000000" w:themeColor="text1"/>
               </w:rPr>
-              <w:t xml:space="preserve"> </w:t>
-            </w:r>
-            <w:proofErr w:type="spellStart"/>
-            <w:r>
-              <w:rPr>
-                <w:color w:val="000000" w:themeColor="text1"/>
-              </w:rPr>
-              <w:t>Besiki</w:t>
-            </w:r>
-            <w:proofErr w:type="spellEnd"/>
-            <w:r>
-              <w:rPr>
-                <w:color w:val="000000" w:themeColor="text1"/>
-              </w:rPr>
-              <w:t xml:space="preserve"> </w:t>
-            </w:r>
-            <w:proofErr w:type="spellStart"/>
-            <w:r>
-              <w:rPr>
-                <w:color w:val="000000" w:themeColor="text1"/>
-              </w:rPr>
-              <w:t>Stvilia</w:t>
-            </w:r>
-            <w:proofErr w:type="spellEnd"/>
-            <w:r>
-              <w:rPr>
-                <w:color w:val="000000" w:themeColor="text1"/>
-              </w:rPr>
-              <w:t>)</w:t>
+              <w:t xml:space="preserve"> Besiki Stvilia)</w:t>
             </w:r>
           </w:p>
         </w:tc>
@@ -13842,21 +13528,7 @@
               <w:rPr>
                 <w:color w:val="000000" w:themeColor="text1"/>
               </w:rPr>
-              <w:t xml:space="preserve"> (with PIs: </w:t>
-            </w:r>
-            <w:proofErr w:type="spellStart"/>
-            <w:r>
-              <w:rPr>
-                <w:color w:val="000000" w:themeColor="text1"/>
-              </w:rPr>
-              <w:t>Hyunkyoung</w:t>
-            </w:r>
-            <w:proofErr w:type="spellEnd"/>
-            <w:r>
-              <w:rPr>
-                <w:color w:val="000000" w:themeColor="text1"/>
-              </w:rPr>
-              <w:t xml:space="preserve"> Oh, Yura Lee, </w:t>
+              <w:t xml:space="preserve"> (with PIs: Hyunkyoung Oh, Yura Lee, </w:t>
             </w:r>
             <w:r>
               <w:rPr>
@@ -14106,11 +13778,9 @@
             <w:r>
               <w:t xml:space="preserve">2014 </w:t>
             </w:r>
-            <w:proofErr w:type="spellStart"/>
             <w:r>
               <w:t>iConference</w:t>
             </w:r>
-            <w:proofErr w:type="spellEnd"/>
             <w:r>
               <w:t xml:space="preserve">, Berlin, Germany. </w:t>
             </w:r>
@@ -22823,43 +22493,7 @@
                 <w:i/>
                 <w:iCs/>
               </w:rPr>
-              <w:t xml:space="preserve">Allied disciplinary perspectives in </w:t>
-            </w:r>
-            <w:proofErr w:type="spellStart"/>
-            <w:r>
-              <w:rPr>
-                <w:rFonts w:eastAsiaTheme="minorEastAsia"/>
-                <w:i/>
-                <w:iCs/>
-              </w:rPr>
-              <w:t>iSchools</w:t>
-            </w:r>
-            <w:proofErr w:type="spellEnd"/>
-            <w:r>
-              <w:rPr>
-                <w:rFonts w:eastAsiaTheme="minorEastAsia"/>
-                <w:i/>
-                <w:iCs/>
-              </w:rPr>
-              <w:t xml:space="preserve"> and the </w:t>
-            </w:r>
-            <w:proofErr w:type="spellStart"/>
-            <w:r>
-              <w:rPr>
-                <w:rFonts w:eastAsiaTheme="minorEastAsia"/>
-                <w:i/>
-                <w:iCs/>
-              </w:rPr>
-              <w:t>iSchools</w:t>
-            </w:r>
-            <w:proofErr w:type="spellEnd"/>
-            <w:r>
-              <w:rPr>
-                <w:rFonts w:eastAsiaTheme="minorEastAsia"/>
-                <w:i/>
-                <w:iCs/>
-              </w:rPr>
-              <w:t xml:space="preserve"> doctoral experience</w:t>
+              <w:t>Allied disciplinary perspectives in iSchools and the iSchools doctoral experience</w:t>
             </w:r>
           </w:p>
         </w:tc>
@@ -24464,21 +24098,12 @@
                 <w:b/>
               </w:rPr>
             </w:pPr>
-            <w:proofErr w:type="spellStart"/>
             <w:r>
               <w:rPr>
                 <w:i/>
                 <w:iCs/>
               </w:rPr>
-              <w:t>Behaviour</w:t>
-            </w:r>
-            <w:proofErr w:type="spellEnd"/>
-            <w:r>
-              <w:rPr>
-                <w:i/>
-                <w:iCs/>
-              </w:rPr>
-              <w:t xml:space="preserve"> &amp; Information Technology</w:t>
+              <w:t>Behaviour &amp; Information Technology</w:t>
             </w:r>
           </w:p>
         </w:tc>
@@ -24762,12 +24387,10 @@
             </w:tcMar>
           </w:tcPr>
           <w:p>
-            <w:proofErr w:type="spellStart"/>
             <w:r>
               <w:lastRenderedPageBreak/>
               <w:t>iConference</w:t>
             </w:r>
-            <w:proofErr w:type="spellEnd"/>
           </w:p>
         </w:tc>
         <w:tc>
@@ -24882,11 +24505,9 @@
             <w:pPr>
               <w:jc w:val="left"/>
             </w:pPr>
-            <w:proofErr w:type="spellStart"/>
             <w:r>
               <w:t>iConference</w:t>
             </w:r>
-            <w:proofErr w:type="spellEnd"/>
           </w:p>
         </w:tc>
         <w:tc>
@@ -25131,13 +24752,8 @@
                 <w:b/>
               </w:rPr>
             </w:pPr>
-            <w:proofErr w:type="spellStart"/>
-            <w:r>
-              <w:t>iConference</w:t>
-            </w:r>
-            <w:proofErr w:type="spellEnd"/>
-            <w:r>
-              <w:t xml:space="preserve"> </w:t>
+            <w:r>
+              <w:t xml:space="preserve">iConference </w:t>
             </w:r>
           </w:p>
         </w:tc>
@@ -26999,23 +26615,7 @@
               <w:jc w:val="left"/>
             </w:pPr>
             <w:r>
-              <w:t xml:space="preserve">Member, </w:t>
-            </w:r>
-            <w:proofErr w:type="spellStart"/>
-            <w:r>
-              <w:t>Omorodion</w:t>
-            </w:r>
-            <w:proofErr w:type="spellEnd"/>
-            <w:r>
-              <w:t xml:space="preserve"> </w:t>
-            </w:r>
-            <w:proofErr w:type="spellStart"/>
-            <w:r>
-              <w:t>Okuonghae</w:t>
-            </w:r>
-            <w:proofErr w:type="spellEnd"/>
-            <w:r>
-              <w:t>, UWM SOIS</w:t>
+              <w:t>Member, Omorodion Okuonghae, UWM SOIS</w:t>
             </w:r>
           </w:p>
         </w:tc>
@@ -27470,13 +27070,8 @@
               <w:lastRenderedPageBreak/>
               <w:t xml:space="preserve">Member, </w:t>
             </w:r>
-            <w:proofErr w:type="spellStart"/>
-            <w:r>
-              <w:t>Shengang</w:t>
-            </w:r>
-            <w:proofErr w:type="spellEnd"/>
-            <w:r>
-              <w:t xml:space="preserve"> Wang</w:t>
+            <w:r>
+              <w:t>Shengang Wang</w:t>
             </w:r>
             <w:r>
               <w:t xml:space="preserve">, </w:t>
@@ -27661,15 +27256,7 @@
               <w:t xml:space="preserve">Member, </w:t>
             </w:r>
             <w:r>
-              <w:t xml:space="preserve">Tae </w:t>
-            </w:r>
-            <w:proofErr w:type="spellStart"/>
-            <w:r>
-              <w:t>Hee</w:t>
-            </w:r>
-            <w:proofErr w:type="spellEnd"/>
-            <w:r>
-              <w:t xml:space="preserve"> Lee</w:t>
+              <w:t>Tae Hee Lee</w:t>
             </w:r>
             <w:r>
               <w:t xml:space="preserve">, </w:t>
@@ -27764,13 +27351,8 @@
               <w:t xml:space="preserve">Member, </w:t>
             </w:r>
             <w:r>
-              <w:t xml:space="preserve">Mutasim </w:t>
-            </w:r>
-            <w:proofErr w:type="spellStart"/>
-            <w:r>
-              <w:t>Alfadhel</w:t>
-            </w:r>
-            <w:proofErr w:type="spellEnd"/>
+              <w:t>Mutasim Alfadhel</w:t>
+            </w:r>
           </w:p>
         </w:tc>
         <w:tc>
@@ -27857,16 +27439,8 @@
               <w:rPr>
                 <w:rFonts w:eastAsiaTheme="minorEastAsia"/>
               </w:rPr>
-              <w:t xml:space="preserve">Yazeed </w:t>
-            </w:r>
-            <w:proofErr w:type="spellStart"/>
-            <w:r>
-              <w:rPr>
-                <w:rFonts w:eastAsiaTheme="minorEastAsia"/>
-              </w:rPr>
-              <w:t>Alhumaidan</w:t>
-            </w:r>
-            <w:proofErr w:type="spellEnd"/>
+              <w:t>Yazeed Alhumaidan</w:t>
+            </w:r>
           </w:p>
         </w:tc>
         <w:tc>
@@ -28716,7 +28290,10 @@
     <w:sectPr>
       <w:headerReference w:type="even" r:id="rId64"/>
       <w:headerReference w:type="default" r:id="rId65"/>
-      <w:footerReference w:type="first" r:id="rId66"/>
+      <w:footerReference w:type="even" r:id="rId66"/>
+      <w:footerReference w:type="default" r:id="rId67"/>
+      <w:headerReference w:type="first" r:id="rId68"/>
+      <w:footerReference w:type="first" r:id="rId69"/>
       <w:pgSz w:w="12240" w:h="15840"/>
       <w:pgMar w:top="1440" w:right="1440" w:bottom="1440" w:left="1440" w:header="720" w:footer="720" w:gutter="0"/>
       <w:cols w:space="720"/>
@@ -28751,6 +28328,26 @@
   <w:p>
     <w:pPr>
       <w:pStyle w:val="Footer"/>
+    </w:pPr>
+  </w:p>
+</w:ftr>
+</file>
+
+<file path=word/footer2.xml><?xml version="1.0" encoding="utf-8"?>
+<w:ftr xmlns:wpc="http://schemas.microsoft.com/office/word/2010/wordprocessingCanvas" xmlns:cx="http://schemas.microsoft.com/office/drawing/2014/chartex" xmlns:cx1="http://schemas.microsoft.com/office/drawing/2015/9/8/chartex" xmlns:cx2="http://schemas.microsoft.com/office/drawing/2015/10/21/chartex" xmlns:cx3="http://schemas.microsoft.com/office/drawing/2016/5/9/chartex" xmlns:cx4="http://schemas.microsoft.com/office/drawing/2016/5/10/chartex" xmlns:cx5="http://schemas.microsoft.com/office/drawing/2016/5/11/chartex" xmlns:cx6="http://schemas.microsoft.com/office/drawing/2016/5/12/chartex" xmlns:cx7="http://schemas.microsoft.com/office/drawing/2016/5/13/chartex" xmlns:cx8="http://schemas.microsoft.com/office/drawing/2016/5/14/chartex" xmlns:mc="http://schemas.openxmlformats.org/markup-compatibility/2006" xmlns:aink="http://schemas.microsoft.com/office/drawing/2016/ink" xmlns:am3d="http://schemas.microsoft.com/office/drawing/2017/model3d" xmlns:o="urn:schemas-microsoft-com:office:office" xmlns:oel="http://schemas.microsoft.com/office/2019/extlst" xmlns:r="http://schemas.openxmlformats.org/officeDocument/2006/relationships" xmlns:m="http://schemas.openxmlformats.org/officeDocument/2006/math" xmlns:v="urn:schemas-microsoft-com:vml" xmlns:wp14="http://schemas.microsoft.com/office/word/2010/wordprocessingDrawing" xmlns:wp="http://schemas.openxmlformats.org/drawingml/2006/wordprocessingDrawing" xmlns:w10="urn:schemas-microsoft-com:office:word" xmlns:w="http://schemas.openxmlformats.org/wordprocessingml/2006/main" xmlns:w14="http://schemas.microsoft.com/office/word/2010/wordml" xmlns:w15="http://schemas.microsoft.com/office/word/2012/wordml" xmlns:w16cex="http://schemas.microsoft.com/office/word/2018/wordml/cex" xmlns:w16cid="http://schemas.microsoft.com/office/word/2016/wordml/cid" xmlns:w16="http://schemas.microsoft.com/office/word/2018/wordml" xmlns:w16du="http://schemas.microsoft.com/office/word/2023/wordml/word16du" xmlns:w16sdtdh="http://schemas.microsoft.com/office/word/2020/wordml/sdtdatahash" xmlns:w16sdtfl="http://schemas.microsoft.com/office/word/2024/wordml/sdtformatlock" xmlns:w16se="http://schemas.microsoft.com/office/word/2015/wordml/symex" xmlns:wpg="http://schemas.microsoft.com/office/word/2010/wordprocessingGroup" xmlns:wpi="http://schemas.microsoft.com/office/word/2010/wordprocessingInk" xmlns:wne="http://schemas.microsoft.com/office/word/2006/wordml" xmlns:wps="http://schemas.microsoft.com/office/word/2010/wordprocessingShape" mc:Ignorable="w14 w15 w16se w16cid w16 w16cex w16sdtdh w16sdtfl w16du wp14">
+  <w:p>
+    <w:pPr>
+      <w:pStyle w:val="Footer"/>
+    </w:pPr>
+  </w:p>
+</w:ftr>
+</file>
+
+<file path=word/footer3.xml><?xml version="1.0" encoding="utf-8"?>
+<w:ftr xmlns:wpc="http://schemas.microsoft.com/office/word/2010/wordprocessingCanvas" xmlns:cx="http://schemas.microsoft.com/office/drawing/2014/chartex" xmlns:cx1="http://schemas.microsoft.com/office/drawing/2015/9/8/chartex" xmlns:cx2="http://schemas.microsoft.com/office/drawing/2015/10/21/chartex" xmlns:cx3="http://schemas.microsoft.com/office/drawing/2016/5/9/chartex" xmlns:cx4="http://schemas.microsoft.com/office/drawing/2016/5/10/chartex" xmlns:cx5="http://schemas.microsoft.com/office/drawing/2016/5/11/chartex" xmlns:cx6="http://schemas.microsoft.com/office/drawing/2016/5/12/chartex" xmlns:cx7="http://schemas.microsoft.com/office/drawing/2016/5/13/chartex" xmlns:cx8="http://schemas.microsoft.com/office/drawing/2016/5/14/chartex" xmlns:mc="http://schemas.openxmlformats.org/markup-compatibility/2006" xmlns:aink="http://schemas.microsoft.com/office/drawing/2016/ink" xmlns:am3d="http://schemas.microsoft.com/office/drawing/2017/model3d" xmlns:o="urn:schemas-microsoft-com:office:office" xmlns:oel="http://schemas.microsoft.com/office/2019/extlst" xmlns:r="http://schemas.openxmlformats.org/officeDocument/2006/relationships" xmlns:m="http://schemas.openxmlformats.org/officeDocument/2006/math" xmlns:v="urn:schemas-microsoft-com:vml" xmlns:wp14="http://schemas.microsoft.com/office/word/2010/wordprocessingDrawing" xmlns:wp="http://schemas.openxmlformats.org/drawingml/2006/wordprocessingDrawing" xmlns:w10="urn:schemas-microsoft-com:office:word" xmlns:w="http://schemas.openxmlformats.org/wordprocessingml/2006/main" xmlns:w14="http://schemas.microsoft.com/office/word/2010/wordml" xmlns:w15="http://schemas.microsoft.com/office/word/2012/wordml" xmlns:w16cex="http://schemas.microsoft.com/office/word/2018/wordml/cex" xmlns:w16cid="http://schemas.microsoft.com/office/word/2016/wordml/cid" xmlns:w16="http://schemas.microsoft.com/office/word/2018/wordml" xmlns:w16du="http://schemas.microsoft.com/office/word/2023/wordml/word16du" xmlns:w16sdtdh="http://schemas.microsoft.com/office/word/2020/wordml/sdtdatahash" xmlns:w16sdtfl="http://schemas.microsoft.com/office/word/2024/wordml/sdtformatlock" xmlns:w16se="http://schemas.microsoft.com/office/word/2015/wordml/symex" xmlns:wpg="http://schemas.microsoft.com/office/word/2010/wordprocessingGroup" xmlns:wpi="http://schemas.microsoft.com/office/word/2010/wordprocessingInk" xmlns:wne="http://schemas.microsoft.com/office/word/2006/wordml" xmlns:wps="http://schemas.microsoft.com/office/word/2010/wordprocessingShape" mc:Ignorable="w14 w15 w16se w16cid w16 w16cex w16sdtdh w16sdtfl w16du wp14">
+  <w:p>
+    <w:pPr>
+      <w:pStyle w:val="Footer"/>
       <w:rPr>
         <w:i/>
         <w:iCs/>
@@ -28761,14 +28358,21 @@
         <w:i/>
         <w:iCs/>
       </w:rPr>
-      <w:t xml:space="preserve">Last Update: </w:t>
+      <w:t>Last Update:</w:t>
     </w:r>
     <w:r>
       <w:rPr>
         <w:i/>
         <w:iCs/>
       </w:rPr>
-      <w:t>April 24, 2026</w:t>
+      <w:t xml:space="preserve"> June 3</w:t>
+    </w:r>
+    <w:r>
+      <w:rPr>
+        <w:i/>
+        <w:iCs/>
+      </w:rPr>
+      <w:t>, 2026</w:t>
     </w:r>
   </w:p>
   <w:p>
@@ -28965,6 +28569,16 @@
       </w:rPr>
       <w:t>E</w:t>
     </w:r>
+  </w:p>
+</w:hdr>
+</file>
+
+<file path=word/header3.xml><?xml version="1.0" encoding="utf-8"?>
+<w:hdr xmlns:wpc="http://schemas.microsoft.com/office/word/2010/wordprocessingCanvas" xmlns:cx="http://schemas.microsoft.com/office/drawing/2014/chartex" xmlns:cx1="http://schemas.microsoft.com/office/drawing/2015/9/8/chartex" xmlns:cx2="http://schemas.microsoft.com/office/drawing/2015/10/21/chartex" xmlns:cx3="http://schemas.microsoft.com/office/drawing/2016/5/9/chartex" xmlns:cx4="http://schemas.microsoft.com/office/drawing/2016/5/10/chartex" xmlns:cx5="http://schemas.microsoft.com/office/drawing/2016/5/11/chartex" xmlns:cx6="http://schemas.microsoft.com/office/drawing/2016/5/12/chartex" xmlns:cx7="http://schemas.microsoft.com/office/drawing/2016/5/13/chartex" xmlns:cx8="http://schemas.microsoft.com/office/drawing/2016/5/14/chartex" xmlns:mc="http://schemas.openxmlformats.org/markup-compatibility/2006" xmlns:aink="http://schemas.microsoft.com/office/drawing/2016/ink" xmlns:am3d="http://schemas.microsoft.com/office/drawing/2017/model3d" xmlns:o="urn:schemas-microsoft-com:office:office" xmlns:oel="http://schemas.microsoft.com/office/2019/extlst" xmlns:r="http://schemas.openxmlformats.org/officeDocument/2006/relationships" xmlns:m="http://schemas.openxmlformats.org/officeDocument/2006/math" xmlns:v="urn:schemas-microsoft-com:vml" xmlns:wp14="http://schemas.microsoft.com/office/word/2010/wordprocessingDrawing" xmlns:wp="http://schemas.openxmlformats.org/drawingml/2006/wordprocessingDrawing" xmlns:w10="urn:schemas-microsoft-com:office:word" xmlns:w="http://schemas.openxmlformats.org/wordprocessingml/2006/main" xmlns:w14="http://schemas.microsoft.com/office/word/2010/wordml" xmlns:w15="http://schemas.microsoft.com/office/word/2012/wordml" xmlns:w16cex="http://schemas.microsoft.com/office/word/2018/wordml/cex" xmlns:w16cid="http://schemas.microsoft.com/office/word/2016/wordml/cid" xmlns:w16="http://schemas.microsoft.com/office/word/2018/wordml" xmlns:w16du="http://schemas.microsoft.com/office/word/2023/wordml/word16du" xmlns:w16sdtdh="http://schemas.microsoft.com/office/word/2020/wordml/sdtdatahash" xmlns:w16sdtfl="http://schemas.microsoft.com/office/word/2024/wordml/sdtformatlock" xmlns:w16se="http://schemas.microsoft.com/office/word/2015/wordml/symex" xmlns:wpg="http://schemas.microsoft.com/office/word/2010/wordprocessingGroup" xmlns:wpi="http://schemas.microsoft.com/office/word/2010/wordprocessingInk" xmlns:wne="http://schemas.microsoft.com/office/word/2006/wordml" xmlns:wps="http://schemas.microsoft.com/office/word/2010/wordprocessingShape" mc:Ignorable="w14 w15 w16se w16cid w16 w16cex w16sdtdh w16sdtfl w16du wp14">
+  <w:p>
+    <w:pPr>
+      <w:pStyle w:val="Header"/>
+    </w:pPr>
   </w:p>
 </w:hdr>
 </file>

</xml_diff>